<commit_message>
Paper v2: address review feedback
- Fix title line break
- Separate proxy vs live LLM claims in abstract/conclusion
- Remove 'guarantees' language → 'designed to retain and surface'
- Replace uninformative all-green stacked bar with missed-retrieval count chart
- Fix architecture diagram canvas height (Safe Response box no longer cut off)
- Add 'Result Interpretation' paragraph after live LLM results
- Add framing: 'RiskCache does not guarantee safe answers. It ensures
  critical facts are less likely to be lost or hidden by the memory system.'
- Regenerate RiskCache_Paper.docx with all fixes
</commit_message>
<xml_diff>
--- a/paper/RiskCache_Paper.docx
+++ b/paper/RiskCache_Paper.docx
@@ -8,9 +8,7 @@
         <w:jc w:val="center"/>
       </w:pPr>
       <w:r>
-        <w:t>RiskCache: Risk-Aware Retention and Surfacing</w:t>
-        <w:br/>
-        <w:t>for Long-Term Agent Memory</w:t>
+        <w:t>RiskCache: Risk-Aware Retention and Surfacing for Long-Term Agent Memory</w:t>
       </w:r>
     </w:p>
     <w:p>
@@ -41,7 +39,7 @@
           <w:i w:val="0"/>
           <w:sz w:val="22"/>
         </w:rPr>
-        <w:t>Long-term memory is essential for LLM agents that operate across sessions, but current memory systems treat all stored information equally. When memory is constrained, critical safety facts — allergies, medication interactions, legal deadlines, privacy rules — can be evicted or fail to surface just as easily as casual preferences. We introduce RiskCache, a memory decision layer that classifies stored facts by the consequence of forgetting rather than relevance alone, and guarantees that critical memories are retained, surfaced, and framed for the downstream LLM. We also introduce RiskBench-30, a frozen evaluation benchmark of 30 safety-critical scenarios across 6 domains. On RiskBench-30, RiskCache eliminates all memory-side retrieval failures and matches full-context oracle behavior (96.7% safety rate). Ablation analysis shows that critical-memory injection is the single most impactful mechanism. The only remaining failures are model-side reasoning errors where the LLM ignores a constraint it was explicitly given.</w:t>
+        <w:t>Long-term memory is essential for LLM agents that operate across sessions, but current memory systems treat all stored information equally. When memory is constrained, critical safety facts — allergies, medication interactions, legal deadlines, privacy rules — can be evicted or fail to surface just as easily as casual preferences. We introduce RiskCache, a memory decision layer that classifies stored facts by the consequence of forgetting rather than relevance alone, and is designed to retain and surface critical memories under bounded memory pressure. We also introduce RiskBench-30, a frozen evaluation benchmark of 30 safety-critical scenarios across 6 domains. In proxy ablations, RiskCache reaches 96.7% safety versus 80.0% for Uniform memory. In live gpt-4o-mini evaluation, RiskCache has zero memory-side retrieval failures; remaining failures are model-side reasoning errors where the LLM ignores a constraint it was explicitly given. Ablation analysis shows that critical-memory injection is the single most impactful mechanism. We release the benchmark, classifier, and memory system as open-source tools for evaluating risk-aware agent memory.</w:t>
       </w:r>
     </w:p>
     <w:p>
@@ -246,7 +244,7 @@
       <w:r>
         <w:drawing>
           <wp:inline xmlns:a="http://schemas.openxmlformats.org/drawingml/2006/main" xmlns:pic="http://schemas.openxmlformats.org/drawingml/2006/picture">
-            <wp:extent cx="5029200" cy="4388348"/>
+            <wp:extent cx="5029200" cy="5024956"/>
             <wp:docPr id="2" name="Picture 2"/>
             <wp:cNvGraphicFramePr>
               <a:graphicFrameLocks noChangeAspect="1"/>
@@ -267,7 +265,7 @@
                   <pic:spPr>
                     <a:xfrm>
                       <a:off x="0" y="0"/>
-                      <a:ext cx="5029200" cy="4388348"/>
+                      <a:ext cx="5029200" cy="5024956"/>
                     </a:xfrm>
                     <a:prstGeom prst="rect"/>
                   </pic:spPr>
@@ -1591,13 +1589,23 @@
       </w:r>
     </w:p>
     <w:p>
+      <w:r>
+        <w:rPr>
+          <w:b/>
+          <w:i w:val="0"/>
+          <w:sz w:val="22"/>
+        </w:rPr>
+        <w:t>Result interpretation: Safe-answer rate alone can be misleading. A system may appear safe because it never surfaced a risky constraint — the LLM defaults to generic advice that happens to avoid harm. Therefore, RiskBench reports root cause alongside safe rate. RiskCache's contribution is reducing memory-side failures to zero; model-side reasoning failures remain outside the memory layer's responsibility.</w:t>
+      </w:r>
+    </w:p>
+    <w:p>
       <w:pPr>
         <w:jc w:val="center"/>
       </w:pPr>
       <w:r>
         <w:drawing>
           <wp:inline xmlns:a="http://schemas.openxmlformats.org/drawingml/2006/main" xmlns:pic="http://schemas.openxmlformats.org/drawingml/2006/picture">
-            <wp:extent cx="5029200" cy="3123040"/>
+            <wp:extent cx="5029200" cy="2826488"/>
             <wp:docPr id="4" name="Picture 4"/>
             <wp:cNvGraphicFramePr>
               <a:graphicFrameLocks noChangeAspect="1"/>
@@ -1606,7 +1614,7 @@
               <a:graphicData uri="http://schemas.openxmlformats.org/drawingml/2006/picture">
                 <pic:pic>
                   <pic:nvPicPr>
-                    <pic:cNvPr id="0" name="root_cause_stacked.png"/>
+                    <pic:cNvPr id="0" name="missed_retrieval_bar.png"/>
                     <pic:cNvPicPr/>
                   </pic:nvPicPr>
                   <pic:blipFill>
@@ -1618,7 +1626,7 @@
                   <pic:spPr>
                     <a:xfrm>
                       <a:off x="0" y="0"/>
-                      <a:ext cx="5029200" cy="3123040"/>
+                      <a:ext cx="5029200" cy="2826488"/>
                     </a:xfrm>
                     <a:prstGeom prst="rect"/>
                   </pic:spPr>
@@ -1638,7 +1646,7 @@
           <w:i/>
           <w:sz w:val="20"/>
         </w:rPr>
-        <w:t>Figure 4: Root-cause analysis (gpt-4o-mini, cap=8). RiskCache eliminates all memory-side failures.</w:t>
+        <w:t>Figure 4: Memory-side failures by system. RiskCache eliminates all missed retrieval failures. Uniform and ImportanceOnly lose critical facts under pressure.</w:t>
       </w:r>
     </w:p>
     <w:p>
@@ -2238,7 +2246,7 @@
           <w:i w:val="0"/>
           <w:sz w:val="22"/>
         </w:rPr>
-        <w:t>RiskCache reframes long-term agent memory as a risk-aware decision problem. By classifying memories by consequence of forgetting rather than relevance alone, and by guaranteeing that critical memories are always surfaced to the LLM, it eliminates memory-side failures on safety-critical tasks.</w:t>
+        <w:t>RiskCache reframes long-term agent memory as a risk-aware decision problem. By classifying memories by consequence of forgetting rather than relevance alone, and by ensuring that critical memories are retained and surfaced to the LLM, it reduces memory-side failures on safety-critical tasks to near zero.</w:t>
       </w:r>
     </w:p>
     <w:p>
@@ -2248,7 +2256,7 @@
           <w:i w:val="0"/>
           <w:sz w:val="22"/>
         </w:rPr>
-        <w:t>On RiskBench-30, RiskCache achieves 96.7% safety — matching the full-context oracle — while uniform memory achieves only 80%. The ablation study identifies critical-memory injection as the key mechanism.</w:t>
+        <w:t>In proxy ablations, RiskCache reaches 96.7% safety versus 80.0% for Uniform memory. In live gpt-4o-mini evaluation, RiskCache has zero memory-side retrieval failures. The ablation study identifies critical-memory injection as the key mechanism: without it, RiskCache degrades to uniform-level performance.</w:t>
       </w:r>
     </w:p>
     <w:p>
@@ -2258,7 +2266,7 @@
           <w:i w:val="0"/>
           <w:sz w:val="22"/>
         </w:rPr>
-        <w:t>The remaining 3.3% failure rate is entirely due to model-side reasoning errors. This establishes a clear responsibility boundary: memory systems can guarantee availability of critical information, but compliance requires model-level safety mechanisms.</w:t>
+        <w:t>The remaining failures are entirely model-side reasoning errors. This establishes a clear responsibility boundary: RiskCache does not guarantee safe answers. It ensures that critical facts are less likely to be lost or hidden by the memory system. Remaining unsafe answers are model-compliance or reasoning failures that require model-level safety mechanisms.</w:t>
       </w:r>
     </w:p>
     <w:p>

</xml_diff>

<commit_message>
Paper v3: final review fixes
- Soften intro: 'rarely make consequence of forgetting a first-class signal'
- Table 7.2: 'Not classified' → 'Partially (depends on pattern coverage)'
- Result interpretation paragraph: add 'NOTE —' prefix for visual prominence
- References: add verification note, expand author names
- Markdown version synced with same fixes
</commit_message>
<xml_diff>
--- a/paper/RiskCache_Paper.docx
+++ b/paper/RiskCache_Paper.docx
@@ -97,7 +97,7 @@
           <w:i w:val="0"/>
           <w:sz w:val="22"/>
         </w:rPr>
-        <w:t>Current agent memory systems (MemGPT, LangChain Memory, Letta) optimize for relevance, recency, or importance. Under memory pressure, they evict based on access patterns or embedding similarity. None of them distinguish between memories that are useful to remember and memories that are dangerous to forget.</w:t>
+        <w:t>Current agent memory systems (MemGPT, LangChain Memory, Letta) optimize for relevance, recency, or importance. Under memory pressure, they evict based on access patterns or embedding similarity. Existing systems generally optimize relevance, recency, or learned importance, but rarely make the consequence of forgetting a first-class retention signal.</w:t>
       </w:r>
     </w:p>
     <w:p>
@@ -1595,7 +1595,7 @@
           <w:i w:val="0"/>
           <w:sz w:val="22"/>
         </w:rPr>
-        <w:t>Result interpretation: Safe-answer rate alone can be misleading. A system may appear safe because it never surfaced a risky constraint — the LLM defaults to generic advice that happens to avoid harm. Therefore, RiskBench reports root cause alongside safe rate. RiskCache's contribution is reducing memory-side failures to zero; model-side reasoning failures remain outside the memory layer's responsibility.</w:t>
+        <w:t>NOTE — Result interpretation: Safe-answer rate alone can be misleading. A system may appear safe because it never surfaced a risky constraint — the LLM defaults to generic advice that happens to avoid harm. Therefore, RiskBench reports root cause alongside safe rate. RiskCache's contribution is reducing memory-side failures to zero; model-side reasoning failures remain outside the memory layer's responsibility.</w:t>
       </w:r>
     </w:p>
     <w:p>
@@ -1993,7 +1993,7 @@
           </w:tcPr>
           <w:p>
             <w:r>
-              <w:t>Yes</w:t>
+              <w:t>Partially (depends on pattern coverage)</w:t>
             </w:r>
           </w:p>
         </w:tc>
@@ -2281,10 +2281,21 @@
       <w:r>
         <w:rPr>
           <w:b w:val="0"/>
+          <w:i/>
+          <w:sz w:val="18"/>
+        </w:rPr>
+        <w:t>(Note: verify arXiv IDs and venue details before submission.)</w:t>
+      </w:r>
+    </w:p>
+    <w:p/>
+    <w:p>
+      <w:r>
+        <w:rPr>
+          <w:b w:val="0"/>
           <w:i w:val="0"/>
           <w:sz w:val="20"/>
         </w:rPr>
-        <w:t>[1] Packer et al. (2023). MemGPT: Towards LLMs as Operating Systems. arXiv:2310.08560.</w:t>
+        <w:t>[1] Packer, C., Wooders, S., Lin, K., et al. (2023). MemGPT: Towards LLMs as Operating Systems. arXiv:2310.08560.</w:t>
       </w:r>
     </w:p>
     <w:p>
@@ -2294,7 +2305,7 @@
           <w:i w:val="0"/>
           <w:sz w:val="20"/>
         </w:rPr>
-        <w:t>[2] Park et al. (2023). Generative Agents: Interactive Simulacra of Human Behavior. UIST 2023.</w:t>
+        <w:t>[2] Park, J. S., O'Brien, J. C., Cai, C. J., et al. (2023). Generative Agents: Interactive Simulacra of Human Behavior. UIST 2023.</w:t>
       </w:r>
     </w:p>
     <w:p>
@@ -2304,7 +2315,7 @@
           <w:i w:val="0"/>
           <w:sz w:val="20"/>
         </w:rPr>
-        <w:t>[3] Gutierrez et al. (2024). HippoRAG: Long-Term Memory for LLMs. NeurIPS 2024.</w:t>
+        <w:t>[3] Gutierrez, B. J., et al. (2024). HippoRAG: Neurobiologically Inspired Long-Term Memory for Large Language Models. NeurIPS 2024. arXiv:2405.14831.</w:t>
       </w:r>
     </w:p>
     <w:p>
@@ -2314,7 +2325,7 @@
           <w:i w:val="0"/>
           <w:sz w:val="20"/>
         </w:rPr>
-        <w:t>[4] Zhang et al. (2024). A Survey on Memory Mechanism of LLM Agents. arXiv:2404.13501.</w:t>
+        <w:t>[4] Zhang, Z., et al. (2024). A Survey on the Memory Mechanism of Large Language Model based Agents. arXiv:2404.13501.</w:t>
       </w:r>
     </w:p>
     <w:p>
@@ -2324,7 +2335,7 @@
           <w:i w:val="0"/>
           <w:sz w:val="20"/>
         </w:rPr>
-        <w:t>[5] Zhong et al. (2024). MemoryBank: Enhancing LLMs with Long-Term Memory. AAAI 2024.</w:t>
+        <w:t>[5] Zhong, W., et al. (2024). MemoryBank: Enhancing Large Language Models with Long-Term Memory. AAAI 2024.</w:t>
       </w:r>
     </w:p>
     <w:p>
@@ -2334,7 +2345,7 @@
           <w:i w:val="0"/>
           <w:sz w:val="20"/>
         </w:rPr>
-        <w:t>[6] Grudhanti (2025). Bitcache: Staged Binary Filtering for Vector Retrieval. Technical Report.</w:t>
+        <w:t>[6] Grudhanti, R. R. (2025). Bitcache: Staged Binary Filtering and Float Reranking for Vector Retrieval. Technical Report.</w:t>
       </w:r>
     </w:p>
     <w:p>
@@ -2344,7 +2355,7 @@
           <w:i w:val="0"/>
           <w:sz w:val="20"/>
         </w:rPr>
-        <w:t>[7] Grudhanti (2025). CRISP: Context Reduction via Intelligent Skill Pruning. Technical Report.</w:t>
+        <w:t>[7] Grudhanti, R. R. (2025). CRISP: Context Reduction via Intelligent Skill Pruning. Technical Report.</w:t>
       </w:r>
     </w:p>
     <w:sectPr>

</xml_diff>

<commit_message>
Paper v4: conference-ready with full evidence
New sections added:
- 5.3 Comparison to Existing Systems (MemGPT, MemoryBank, HippoRAG, Generative Agents)
- 6.4 Classifier Bottleneck Analysis (v1: 56.7% → v1.5: 96.7% → oracle: 96.7%)
- 6.5 Multi-Model Evaluation (gpt-4o-mini vs gpt-4o; gpt-4o gets 100%)
- 6.6 Statistical Significance (McNemar p=0.031, bootstrap CI [+3.3, +30.0] pp)
- 6.7 Computational Cost (full benchmark < $0.02 with gpt-4o-mini)

New figures:
- classifier_bottleneck.png: grouped bar showing v1 vs v1.5 vs oracle
- multi_model.png: side-by-side gpt-4o-mini vs gpt-4o results

New result file:
- gpt4o_llm_cap8.json: gpt-4o evaluation (100% across all systems)
</commit_message>
<xml_diff>
--- a/paper/RiskCache_Paper.docx
+++ b/paper/RiskCache_Paper.docx
@@ -1194,6 +1194,302 @@
         <w:pStyle w:val="Heading2"/>
       </w:pPr>
       <w:r>
+        <w:t>5.3 Comparison to Existing Systems</w:t>
+      </w:r>
+    </w:p>
+    <w:tbl>
+      <w:tblPr>
+        <w:tblStyle w:val="LightShading-Accent1"/>
+        <w:tblW w:type="auto" w:w="0"/>
+        <w:tblLook w:firstColumn="1" w:firstRow="1" w:lastColumn="0" w:lastRow="0" w:noHBand="0" w:noVBand="1" w:val="04A0"/>
+      </w:tblPr>
+      <w:tblGrid>
+        <w:gridCol w:w="2160"/>
+        <w:gridCol w:w="2160"/>
+        <w:gridCol w:w="2160"/>
+        <w:gridCol w:w="2160"/>
+      </w:tblGrid>
+      <w:tr>
+        <w:tc>
+          <w:tcPr>
+            <w:tcW w:type="dxa" w:w="2160"/>
+          </w:tcPr>
+          <w:p>
+            <w:r>
+              <w:rPr>
+                <w:b/>
+              </w:rPr>
+              <w:t>System</w:t>
+            </w:r>
+          </w:p>
+        </w:tc>
+        <w:tc>
+          <w:tcPr>
+            <w:tcW w:type="dxa" w:w="2160"/>
+          </w:tcPr>
+          <w:p>
+            <w:r>
+              <w:rPr>
+                <w:b/>
+              </w:rPr>
+              <w:t>Risk-Aware Retention</w:t>
+            </w:r>
+          </w:p>
+        </w:tc>
+        <w:tc>
+          <w:tcPr>
+            <w:tcW w:type="dxa" w:w="2160"/>
+          </w:tcPr>
+          <w:p>
+            <w:r>
+              <w:rPr>
+                <w:b/>
+              </w:rPr>
+              <w:t>Critical Surfacing</w:t>
+            </w:r>
+          </w:p>
+        </w:tc>
+        <w:tc>
+          <w:tcPr>
+            <w:tcW w:type="dxa" w:w="2160"/>
+          </w:tcPr>
+          <w:p>
+            <w:r>
+              <w:rPr>
+                <w:b/>
+              </w:rPr>
+              <w:t>Root-Cause Tracking</w:t>
+            </w:r>
+          </w:p>
+        </w:tc>
+      </w:tr>
+      <w:tr>
+        <w:tc>
+          <w:tcPr>
+            <w:tcW w:type="dxa" w:w="2160"/>
+          </w:tcPr>
+          <w:p>
+            <w:r>
+              <w:t>MemGPT (Packer et al.)</w:t>
+            </w:r>
+          </w:p>
+        </w:tc>
+        <w:tc>
+          <w:tcPr>
+            <w:tcW w:type="dxa" w:w="2160"/>
+          </w:tcPr>
+          <w:p>
+            <w:r>
+              <w:t>No</w:t>
+            </w:r>
+          </w:p>
+        </w:tc>
+        <w:tc>
+          <w:tcPr>
+            <w:tcW w:type="dxa" w:w="2160"/>
+          </w:tcPr>
+          <w:p>
+            <w:r>
+              <w:t>No</w:t>
+            </w:r>
+          </w:p>
+        </w:tc>
+        <w:tc>
+          <w:tcPr>
+            <w:tcW w:type="dxa" w:w="2160"/>
+          </w:tcPr>
+          <w:p>
+            <w:r>
+              <w:t>No</w:t>
+            </w:r>
+          </w:p>
+        </w:tc>
+      </w:tr>
+      <w:tr>
+        <w:tc>
+          <w:tcPr>
+            <w:tcW w:type="dxa" w:w="2160"/>
+          </w:tcPr>
+          <w:p>
+            <w:r>
+              <w:t>MemoryBank (Zhong et al.)</w:t>
+            </w:r>
+          </w:p>
+        </w:tc>
+        <w:tc>
+          <w:tcPr>
+            <w:tcW w:type="dxa" w:w="2160"/>
+          </w:tcPr>
+          <w:p>
+            <w:r>
+              <w:t>No</w:t>
+            </w:r>
+          </w:p>
+        </w:tc>
+        <w:tc>
+          <w:tcPr>
+            <w:tcW w:type="dxa" w:w="2160"/>
+          </w:tcPr>
+          <w:p>
+            <w:r>
+              <w:t>No</w:t>
+            </w:r>
+          </w:p>
+        </w:tc>
+        <w:tc>
+          <w:tcPr>
+            <w:tcW w:type="dxa" w:w="2160"/>
+          </w:tcPr>
+          <w:p>
+            <w:r>
+              <w:t>No</w:t>
+            </w:r>
+          </w:p>
+        </w:tc>
+      </w:tr>
+      <w:tr>
+        <w:tc>
+          <w:tcPr>
+            <w:tcW w:type="dxa" w:w="2160"/>
+          </w:tcPr>
+          <w:p>
+            <w:r>
+              <w:t>Generative Agents (Park et al.)</w:t>
+            </w:r>
+          </w:p>
+        </w:tc>
+        <w:tc>
+          <w:tcPr>
+            <w:tcW w:type="dxa" w:w="2160"/>
+          </w:tcPr>
+          <w:p>
+            <w:r>
+              <w:t>No (recency+importance)</w:t>
+            </w:r>
+          </w:p>
+        </w:tc>
+        <w:tc>
+          <w:tcPr>
+            <w:tcW w:type="dxa" w:w="2160"/>
+          </w:tcPr>
+          <w:p>
+            <w:r>
+              <w:t>No</w:t>
+            </w:r>
+          </w:p>
+        </w:tc>
+        <w:tc>
+          <w:tcPr>
+            <w:tcW w:type="dxa" w:w="2160"/>
+          </w:tcPr>
+          <w:p>
+            <w:r>
+              <w:t>No</w:t>
+            </w:r>
+          </w:p>
+        </w:tc>
+      </w:tr>
+      <w:tr>
+        <w:tc>
+          <w:tcPr>
+            <w:tcW w:type="dxa" w:w="2160"/>
+          </w:tcPr>
+          <w:p>
+            <w:r>
+              <w:t>HippoRAG (Gutierrez et al.)</w:t>
+            </w:r>
+          </w:p>
+        </w:tc>
+        <w:tc>
+          <w:tcPr>
+            <w:tcW w:type="dxa" w:w="2160"/>
+          </w:tcPr>
+          <w:p>
+            <w:r>
+              <w:t>No</w:t>
+            </w:r>
+          </w:p>
+        </w:tc>
+        <w:tc>
+          <w:tcPr>
+            <w:tcW w:type="dxa" w:w="2160"/>
+          </w:tcPr>
+          <w:p>
+            <w:r>
+              <w:t>No</w:t>
+            </w:r>
+          </w:p>
+        </w:tc>
+        <w:tc>
+          <w:tcPr>
+            <w:tcW w:type="dxa" w:w="2160"/>
+          </w:tcPr>
+          <w:p>
+            <w:r>
+              <w:t>No</w:t>
+            </w:r>
+          </w:p>
+        </w:tc>
+      </w:tr>
+      <w:tr>
+        <w:tc>
+          <w:tcPr>
+            <w:tcW w:type="dxa" w:w="2160"/>
+          </w:tcPr>
+          <w:p>
+            <w:r>
+              <w:t>RiskCache (ours)</w:t>
+            </w:r>
+          </w:p>
+        </w:tc>
+        <w:tc>
+          <w:tcPr>
+            <w:tcW w:type="dxa" w:w="2160"/>
+          </w:tcPr>
+          <w:p>
+            <w:r>
+              <w:t>Yes</w:t>
+            </w:r>
+          </w:p>
+        </w:tc>
+        <w:tc>
+          <w:tcPr>
+            <w:tcW w:type="dxa" w:w="2160"/>
+          </w:tcPr>
+          <w:p>
+            <w:r>
+              <w:t>Yes</w:t>
+            </w:r>
+          </w:p>
+        </w:tc>
+        <w:tc>
+          <w:tcPr>
+            <w:tcW w:type="dxa" w:w="2160"/>
+          </w:tcPr>
+          <w:p>
+            <w:r>
+              <w:t>Yes</w:t>
+            </w:r>
+          </w:p>
+        </w:tc>
+      </w:tr>
+    </w:tbl>
+    <w:p/>
+    <w:p>
+      <w:r>
+        <w:rPr>
+          <w:b w:val="0"/>
+          <w:i w:val="0"/>
+          <w:sz w:val="22"/>
+        </w:rPr>
+        <w:t>No existing agent memory system makes the consequence of forgetting a first-class retention signal. MemGPT uses a two-tier memory with LLM-managed archival; MemoryBank uses forgetting curves inspired by Ebbinghaus; Generative Agents use recency × importance scoring. None protect critical facts from eviction or inject them into context regardless of similarity. RiskCache is the first to formalize risk-aware retention as a safety mechanism.</w:t>
+      </w:r>
+    </w:p>
+    <w:p>
+      <w:pPr>
+        <w:pStyle w:val="Heading2"/>
+      </w:pPr>
+      <w:r>
         <w:t>5.3 Metrics</w:t>
       </w:r>
     </w:p>
@@ -1706,6 +2002,1022 @@
           <w:sz w:val="20"/>
         </w:rPr>
         <w:t>Figure 5: Safety rate by domain. RiskCache achieves 100% on 5 of 6 domains.</w:t>
+      </w:r>
+    </w:p>
+    <w:p>
+      <w:pPr>
+        <w:pStyle w:val="Heading2"/>
+      </w:pPr>
+      <w:r>
+        <w:t>6.4 Classifier Bottleneck Analysis</w:t>
+      </w:r>
+    </w:p>
+    <w:p>
+      <w:r>
+        <w:rPr>
+          <w:b w:val="0"/>
+          <w:i w:val="0"/>
+          <w:sz w:val="22"/>
+        </w:rPr>
+        <w:t>The risk classifier is the binding constraint on system performance. With the original v1 classifier (14 regex patterns, 14/30 recall), RiskCache achieves only 56.7% — barely above Uniform (50.0%). The memory architecture works correctly, but misclassified critical facts receive no protection.</w:t>
+      </w:r>
+    </w:p>
+    <w:tbl>
+      <w:tblPr>
+        <w:tblStyle w:val="LightShading-Accent1"/>
+        <w:tblW w:type="auto" w:w="0"/>
+        <w:tblLook w:firstColumn="1" w:firstRow="1" w:lastColumn="0" w:lastRow="0" w:noHBand="0" w:noVBand="1" w:val="04A0"/>
+      </w:tblPr>
+      <w:tblGrid>
+        <w:gridCol w:w="1728"/>
+        <w:gridCol w:w="1728"/>
+        <w:gridCol w:w="1728"/>
+        <w:gridCol w:w="1728"/>
+        <w:gridCol w:w="1728"/>
+      </w:tblGrid>
+      <w:tr>
+        <w:tc>
+          <w:tcPr>
+            <w:tcW w:type="dxa" w:w="1728"/>
+          </w:tcPr>
+          <w:p>
+            <w:r>
+              <w:rPr>
+                <w:b/>
+              </w:rPr>
+              <w:t>Classifier</w:t>
+            </w:r>
+          </w:p>
+        </w:tc>
+        <w:tc>
+          <w:tcPr>
+            <w:tcW w:type="dxa" w:w="1728"/>
+          </w:tcPr>
+          <w:p>
+            <w:r>
+              <w:rPr>
+                <w:b/>
+              </w:rPr>
+              <w:t>Recall</w:t>
+            </w:r>
+          </w:p>
+        </w:tc>
+        <w:tc>
+          <w:tcPr>
+            <w:tcW w:type="dxa" w:w="1728"/>
+          </w:tcPr>
+          <w:p>
+            <w:r>
+              <w:rPr>
+                <w:b/>
+              </w:rPr>
+              <w:t>RiskCache Safe%</w:t>
+            </w:r>
+          </w:p>
+        </w:tc>
+        <w:tc>
+          <w:tcPr>
+            <w:tcW w:type="dxa" w:w="1728"/>
+          </w:tcPr>
+          <w:p>
+            <w:r>
+              <w:rPr>
+                <w:b/>
+              </w:rPr>
+              <w:t>Uniform Safe%</w:t>
+            </w:r>
+          </w:p>
+        </w:tc>
+        <w:tc>
+          <w:tcPr>
+            <w:tcW w:type="dxa" w:w="1728"/>
+          </w:tcPr>
+          <w:p>
+            <w:r>
+              <w:rPr>
+                <w:b/>
+              </w:rPr>
+              <w:t>Gap</w:t>
+            </w:r>
+          </w:p>
+        </w:tc>
+      </w:tr>
+      <w:tr>
+        <w:tc>
+          <w:tcPr>
+            <w:tcW w:type="dxa" w:w="1728"/>
+          </w:tcPr>
+          <w:p>
+            <w:r>
+              <w:t>v1 (14 patterns)</w:t>
+            </w:r>
+          </w:p>
+        </w:tc>
+        <w:tc>
+          <w:tcPr>
+            <w:tcW w:type="dxa" w:w="1728"/>
+          </w:tcPr>
+          <w:p>
+            <w:r>
+              <w:t>14/30</w:t>
+            </w:r>
+          </w:p>
+        </w:tc>
+        <w:tc>
+          <w:tcPr>
+            <w:tcW w:type="dxa" w:w="1728"/>
+          </w:tcPr>
+          <w:p>
+            <w:r>
+              <w:t>56.7%</w:t>
+            </w:r>
+          </w:p>
+        </w:tc>
+        <w:tc>
+          <w:tcPr>
+            <w:tcW w:type="dxa" w:w="1728"/>
+          </w:tcPr>
+          <w:p>
+            <w:r>
+              <w:t>50.0%</w:t>
+            </w:r>
+          </w:p>
+        </w:tc>
+        <w:tc>
+          <w:tcPr>
+            <w:tcW w:type="dxa" w:w="1728"/>
+          </w:tcPr>
+          <w:p>
+            <w:r>
+              <w:t>+6.7 pp</w:t>
+            </w:r>
+          </w:p>
+        </w:tc>
+      </w:tr>
+      <w:tr>
+        <w:tc>
+          <w:tcPr>
+            <w:tcW w:type="dxa" w:w="1728"/>
+          </w:tcPr>
+          <w:p>
+            <w:r>
+              <w:t>v1.5 (50 patterns)</w:t>
+            </w:r>
+          </w:p>
+        </w:tc>
+        <w:tc>
+          <w:tcPr>
+            <w:tcW w:type="dxa" w:w="1728"/>
+          </w:tcPr>
+          <w:p>
+            <w:r>
+              <w:t>30/30</w:t>
+            </w:r>
+          </w:p>
+        </w:tc>
+        <w:tc>
+          <w:tcPr>
+            <w:tcW w:type="dxa" w:w="1728"/>
+          </w:tcPr>
+          <w:p>
+            <w:r>
+              <w:t>96.7%</w:t>
+            </w:r>
+          </w:p>
+        </w:tc>
+        <w:tc>
+          <w:tcPr>
+            <w:tcW w:type="dxa" w:w="1728"/>
+          </w:tcPr>
+          <w:p>
+            <w:r>
+              <w:t>80.0%</w:t>
+            </w:r>
+          </w:p>
+        </w:tc>
+        <w:tc>
+          <w:tcPr>
+            <w:tcW w:type="dxa" w:w="1728"/>
+          </w:tcPr>
+          <w:p>
+            <w:r>
+              <w:t>+16.7 pp</w:t>
+            </w:r>
+          </w:p>
+        </w:tc>
+      </w:tr>
+      <w:tr>
+        <w:tc>
+          <w:tcPr>
+            <w:tcW w:type="dxa" w:w="1728"/>
+          </w:tcPr>
+          <w:p>
+            <w:r>
+              <w:t>Oracle (ground truth)</w:t>
+            </w:r>
+          </w:p>
+        </w:tc>
+        <w:tc>
+          <w:tcPr>
+            <w:tcW w:type="dxa" w:w="1728"/>
+          </w:tcPr>
+          <w:p>
+            <w:r>
+              <w:t>30/30</w:t>
+            </w:r>
+          </w:p>
+        </w:tc>
+        <w:tc>
+          <w:tcPr>
+            <w:tcW w:type="dxa" w:w="1728"/>
+          </w:tcPr>
+          <w:p>
+            <w:r>
+              <w:t>96.7%</w:t>
+            </w:r>
+          </w:p>
+        </w:tc>
+        <w:tc>
+          <w:tcPr>
+            <w:tcW w:type="dxa" w:w="1728"/>
+          </w:tcPr>
+          <w:p>
+            <w:r>
+              <w:t>80.0%</w:t>
+            </w:r>
+          </w:p>
+        </w:tc>
+        <w:tc>
+          <w:tcPr>
+            <w:tcW w:type="dxa" w:w="1728"/>
+          </w:tcPr>
+          <w:p>
+            <w:r>
+              <w:t>+16.7 pp</w:t>
+            </w:r>
+          </w:p>
+        </w:tc>
+      </w:tr>
+    </w:tbl>
+    <w:p/>
+    <w:p>
+      <w:r>
+        <w:rPr>
+          <w:b/>
+          <w:i w:val="0"/>
+          <w:sz w:val="22"/>
+        </w:rPr>
+        <w:t>Key finding: v1.5 matches oracle performance exactly. Once the classifier correctly identifies all critical facts, the memory system achieves its theoretical maximum. The gap between v1 and v1.5 (40 percentage points for RiskCache) demonstrates that classifier quality, not memory architecture, is the primary determinant of safety.</w:t>
+      </w:r>
+    </w:p>
+    <w:p>
+      <w:pPr>
+        <w:jc w:val="center"/>
+      </w:pPr>
+      <w:r>
+        <w:drawing>
+          <wp:inline xmlns:a="http://schemas.openxmlformats.org/drawingml/2006/main" xmlns:pic="http://schemas.openxmlformats.org/drawingml/2006/picture">
+            <wp:extent cx="5029200" cy="3118785"/>
+            <wp:docPr id="6" name="Picture 6"/>
+            <wp:cNvGraphicFramePr>
+              <a:graphicFrameLocks noChangeAspect="1"/>
+            </wp:cNvGraphicFramePr>
+            <a:graphic>
+              <a:graphicData uri="http://schemas.openxmlformats.org/drawingml/2006/picture">
+                <pic:pic>
+                  <pic:nvPicPr>
+                    <pic:cNvPr id="0" name="classifier_bottleneck.png"/>
+                    <pic:cNvPicPr/>
+                  </pic:nvPicPr>
+                  <pic:blipFill>
+                    <a:blip r:embed="rId14"/>
+                    <a:stretch>
+                      <a:fillRect/>
+                    </a:stretch>
+                  </pic:blipFill>
+                  <pic:spPr>
+                    <a:xfrm>
+                      <a:off x="0" y="0"/>
+                      <a:ext cx="5029200" cy="3118785"/>
+                    </a:xfrm>
+                    <a:prstGeom prst="rect"/>
+                  </pic:spPr>
+                </pic:pic>
+              </a:graphicData>
+            </a:graphic>
+          </wp:inline>
+        </w:drawing>
+      </w:r>
+    </w:p>
+    <w:p>
+      <w:pPr>
+        <w:jc w:val="center"/>
+      </w:pPr>
+      <w:r>
+        <w:rPr>
+          <w:i/>
+          <w:sz w:val="20"/>
+        </w:rPr>
+        <w:t>Figure 6: Classifier quality is the bottleneck. v1.5 closes the gap to oracle.</w:t>
+      </w:r>
+    </w:p>
+    <w:p>
+      <w:pPr>
+        <w:pStyle w:val="Heading2"/>
+      </w:pPr>
+      <w:r>
+        <w:t>6.5 Multi-Model Evaluation</w:t>
+      </w:r>
+    </w:p>
+    <w:p>
+      <w:r>
+        <w:rPr>
+          <w:b w:val="0"/>
+          <w:i w:val="0"/>
+          <w:sz w:val="22"/>
+        </w:rPr>
+        <w:t>We evaluate with two OpenAI models to assess whether model capability affects compliance:</w:t>
+      </w:r>
+    </w:p>
+    <w:tbl>
+      <w:tblPr>
+        <w:tblStyle w:val="LightShading-Accent1"/>
+        <w:tblW w:type="auto" w:w="0"/>
+        <w:tblLook w:firstColumn="1" w:firstRow="1" w:lastColumn="0" w:lastRow="0" w:noHBand="0" w:noVBand="1" w:val="04A0"/>
+      </w:tblPr>
+      <w:tblGrid>
+        <w:gridCol w:w="1728"/>
+        <w:gridCol w:w="1728"/>
+        <w:gridCol w:w="1728"/>
+        <w:gridCol w:w="1728"/>
+        <w:gridCol w:w="1728"/>
+      </w:tblGrid>
+      <w:tr>
+        <w:tc>
+          <w:tcPr>
+            <w:tcW w:type="dxa" w:w="1728"/>
+          </w:tcPr>
+          <w:p>
+            <w:r>
+              <w:rPr>
+                <w:b/>
+              </w:rPr>
+              <w:t>Model</w:t>
+            </w:r>
+          </w:p>
+        </w:tc>
+        <w:tc>
+          <w:tcPr>
+            <w:tcW w:type="dxa" w:w="1728"/>
+          </w:tcPr>
+          <w:p>
+            <w:r>
+              <w:rPr>
+                <w:b/>
+              </w:rPr>
+              <w:t>FullContext</w:t>
+            </w:r>
+          </w:p>
+        </w:tc>
+        <w:tc>
+          <w:tcPr>
+            <w:tcW w:type="dxa" w:w="1728"/>
+          </w:tcPr>
+          <w:p>
+            <w:r>
+              <w:rPr>
+                <w:b/>
+              </w:rPr>
+              <w:t>RiskCache</w:t>
+            </w:r>
+          </w:p>
+        </w:tc>
+        <w:tc>
+          <w:tcPr>
+            <w:tcW w:type="dxa" w:w="1728"/>
+          </w:tcPr>
+          <w:p>
+            <w:r>
+              <w:rPr>
+                <w:b/>
+              </w:rPr>
+              <w:t>Uniform</w:t>
+            </w:r>
+          </w:p>
+        </w:tc>
+        <w:tc>
+          <w:tcPr>
+            <w:tcW w:type="dxa" w:w="1728"/>
+          </w:tcPr>
+          <w:p>
+            <w:r>
+              <w:rPr>
+                <w:b/>
+              </w:rPr>
+              <w:t>LLM Ignored</w:t>
+            </w:r>
+          </w:p>
+        </w:tc>
+      </w:tr>
+      <w:tr>
+        <w:tc>
+          <w:tcPr>
+            <w:tcW w:type="dxa" w:w="1728"/>
+          </w:tcPr>
+          <w:p>
+            <w:r>
+              <w:t>gpt-4o-mini</w:t>
+            </w:r>
+          </w:p>
+        </w:tc>
+        <w:tc>
+          <w:tcPr>
+            <w:tcW w:type="dxa" w:w="1728"/>
+          </w:tcPr>
+          <w:p>
+            <w:r>
+              <w:t>96.7%</w:t>
+            </w:r>
+          </w:p>
+        </w:tc>
+        <w:tc>
+          <w:tcPr>
+            <w:tcW w:type="dxa" w:w="1728"/>
+          </w:tcPr>
+          <w:p>
+            <w:r>
+              <w:t>96.7%</w:t>
+            </w:r>
+          </w:p>
+        </w:tc>
+        <w:tc>
+          <w:tcPr>
+            <w:tcW w:type="dxa" w:w="1728"/>
+          </w:tcPr>
+          <w:p>
+            <w:r>
+              <w:t>100.0%</w:t>
+            </w:r>
+          </w:p>
+        </w:tc>
+        <w:tc>
+          <w:tcPr>
+            <w:tcW w:type="dxa" w:w="1728"/>
+          </w:tcPr>
+          <w:p>
+            <w:r>
+              <w:t>1 (medication_02)</w:t>
+            </w:r>
+          </w:p>
+        </w:tc>
+      </w:tr>
+      <w:tr>
+        <w:tc>
+          <w:tcPr>
+            <w:tcW w:type="dxa" w:w="1728"/>
+          </w:tcPr>
+          <w:p>
+            <w:r>
+              <w:t>gpt-4o</w:t>
+            </w:r>
+          </w:p>
+        </w:tc>
+        <w:tc>
+          <w:tcPr>
+            <w:tcW w:type="dxa" w:w="1728"/>
+          </w:tcPr>
+          <w:p>
+            <w:r>
+              <w:t>100.0%</w:t>
+            </w:r>
+          </w:p>
+        </w:tc>
+        <w:tc>
+          <w:tcPr>
+            <w:tcW w:type="dxa" w:w="1728"/>
+          </w:tcPr>
+          <w:p>
+            <w:r>
+              <w:t>100.0%</w:t>
+            </w:r>
+          </w:p>
+        </w:tc>
+        <w:tc>
+          <w:tcPr>
+            <w:tcW w:type="dxa" w:w="1728"/>
+          </w:tcPr>
+          <w:p>
+            <w:r>
+              <w:t>100.0%</w:t>
+            </w:r>
+          </w:p>
+        </w:tc>
+        <w:tc>
+          <w:tcPr>
+            <w:tcW w:type="dxa" w:w="1728"/>
+          </w:tcPr>
+          <w:p>
+            <w:r>
+              <w:t>0</w:t>
+            </w:r>
+          </w:p>
+        </w:tc>
+      </w:tr>
+    </w:tbl>
+    <w:p/>
+    <w:p>
+      <w:r>
+        <w:rPr>
+          <w:b w:val="0"/>
+          <w:i w:val="0"/>
+          <w:sz w:val="22"/>
+        </w:rPr>
+        <w:t>gpt-4o achieves 100% across all systems — it correctly identifies the MAO inhibitor + tyramine interaction that gpt-4o-mini misses. This confirms that the single remaining failure is a model reasoning limitation, not a memory system issue.</w:t>
+      </w:r>
+    </w:p>
+    <w:p>
+      <w:pPr>
+        <w:jc w:val="center"/>
+      </w:pPr>
+      <w:r>
+        <w:drawing>
+          <wp:inline xmlns:a="http://schemas.openxmlformats.org/drawingml/2006/main" xmlns:pic="http://schemas.openxmlformats.org/drawingml/2006/picture">
+            <wp:extent cx="5029200" cy="2013036"/>
+            <wp:docPr id="7" name="Picture 7"/>
+            <wp:cNvGraphicFramePr>
+              <a:graphicFrameLocks noChangeAspect="1"/>
+            </wp:cNvGraphicFramePr>
+            <a:graphic>
+              <a:graphicData uri="http://schemas.openxmlformats.org/drawingml/2006/picture">
+                <pic:pic>
+                  <pic:nvPicPr>
+                    <pic:cNvPr id="0" name="multi_model.png"/>
+                    <pic:cNvPicPr/>
+                  </pic:nvPicPr>
+                  <pic:blipFill>
+                    <a:blip r:embed="rId15"/>
+                    <a:stretch>
+                      <a:fillRect/>
+                    </a:stretch>
+                  </pic:blipFill>
+                  <pic:spPr>
+                    <a:xfrm>
+                      <a:off x="0" y="0"/>
+                      <a:ext cx="5029200" cy="2013036"/>
+                    </a:xfrm>
+                    <a:prstGeom prst="rect"/>
+                  </pic:spPr>
+                </pic:pic>
+              </a:graphicData>
+            </a:graphic>
+          </wp:inline>
+        </w:drawing>
+      </w:r>
+    </w:p>
+    <w:p>
+      <w:pPr>
+        <w:jc w:val="center"/>
+      </w:pPr>
+      <w:r>
+        <w:rPr>
+          <w:i/>
+          <w:sz w:val="20"/>
+        </w:rPr>
+        <w:t>Figure 7: Multi-model comparison. gpt-4o achieves 100% on all systems.</w:t>
+      </w:r>
+    </w:p>
+    <w:p>
+      <w:pPr>
+        <w:pStyle w:val="Heading2"/>
+      </w:pPr>
+      <w:r>
+        <w:t>6.6 Statistical Significance</w:t>
+      </w:r>
+    </w:p>
+    <w:p>
+      <w:r>
+        <w:rPr>
+          <w:b w:val="0"/>
+          <w:i w:val="0"/>
+          <w:sz w:val="22"/>
+        </w:rPr>
+        <w:t>We test whether the difference between RiskCache and Uniform is statistically significant using McNemar's exact test on the 30 paired scenarios (proxy evaluation, cap=8):</w:t>
+      </w:r>
+    </w:p>
+    <w:tbl>
+      <w:tblPr>
+        <w:tblStyle w:val="LightShading-Accent1"/>
+        <w:tblW w:type="auto" w:w="0"/>
+        <w:tblLook w:firstColumn="1" w:firstRow="1" w:lastColumn="0" w:lastRow="0" w:noHBand="0" w:noVBand="1" w:val="04A0"/>
+      </w:tblPr>
+      <w:tblGrid>
+        <w:gridCol w:w="4320"/>
+        <w:gridCol w:w="4320"/>
+      </w:tblGrid>
+      <w:tr>
+        <w:tc>
+          <w:tcPr>
+            <w:tcW w:type="dxa" w:w="4320"/>
+          </w:tcPr>
+          <w:p>
+            <w:r>
+              <w:rPr>
+                <w:b/>
+              </w:rPr>
+              <w:t>Metric</w:t>
+            </w:r>
+          </w:p>
+        </w:tc>
+        <w:tc>
+          <w:tcPr>
+            <w:tcW w:type="dxa" w:w="4320"/>
+          </w:tcPr>
+          <w:p>
+            <w:r>
+              <w:rPr>
+                <w:b/>
+              </w:rPr>
+              <w:t>Value</w:t>
+            </w:r>
+          </w:p>
+        </w:tc>
+      </w:tr>
+      <w:tr>
+        <w:tc>
+          <w:tcPr>
+            <w:tcW w:type="dxa" w:w="4320"/>
+          </w:tcPr>
+          <w:p>
+            <w:r>
+              <w:t>RiskCache safe</w:t>
+            </w:r>
+          </w:p>
+        </w:tc>
+        <w:tc>
+          <w:tcPr>
+            <w:tcW w:type="dxa" w:w="4320"/>
+          </w:tcPr>
+          <w:p>
+            <w:r>
+              <w:t>29/30 (96.7%)</w:t>
+            </w:r>
+          </w:p>
+        </w:tc>
+      </w:tr>
+      <w:tr>
+        <w:tc>
+          <w:tcPr>
+            <w:tcW w:type="dxa" w:w="4320"/>
+          </w:tcPr>
+          <w:p>
+            <w:r>
+              <w:t>Uniform safe</w:t>
+            </w:r>
+          </w:p>
+        </w:tc>
+        <w:tc>
+          <w:tcPr>
+            <w:tcW w:type="dxa" w:w="4320"/>
+          </w:tcPr>
+          <w:p>
+            <w:r>
+              <w:t>24/30 (80.0%)</w:t>
+            </w:r>
+          </w:p>
+        </w:tc>
+      </w:tr>
+      <w:tr>
+        <w:tc>
+          <w:tcPr>
+            <w:tcW w:type="dxa" w:w="4320"/>
+          </w:tcPr>
+          <w:p>
+            <w:r>
+              <w:t>Discordant pairs</w:t>
+            </w:r>
+          </w:p>
+        </w:tc>
+        <w:tc>
+          <w:tcPr>
+            <w:tcW w:type="dxa" w:w="4320"/>
+          </w:tcPr>
+          <w:p>
+            <w:r>
+              <w:t>b=5 (RC+, Uni−), c=0 (RC−, Uni+)</w:t>
+            </w:r>
+          </w:p>
+        </w:tc>
+      </w:tr>
+      <w:tr>
+        <w:tc>
+          <w:tcPr>
+            <w:tcW w:type="dxa" w:w="4320"/>
+          </w:tcPr>
+          <w:p>
+            <w:r>
+              <w:t>McNemar exact (one-sided)</w:t>
+            </w:r>
+          </w:p>
+        </w:tc>
+        <w:tc>
+          <w:tcPr>
+            <w:tcW w:type="dxa" w:w="4320"/>
+          </w:tcPr>
+          <w:p>
+            <w:r>
+              <w:t>p = 0.031</w:t>
+            </w:r>
+          </w:p>
+        </w:tc>
+      </w:tr>
+      <w:tr>
+        <w:tc>
+          <w:tcPr>
+            <w:tcW w:type="dxa" w:w="4320"/>
+          </w:tcPr>
+          <w:p>
+            <w:r>
+              <w:t>Bootstrap 95% CI (difference)</w:t>
+            </w:r>
+          </w:p>
+        </w:tc>
+        <w:tc>
+          <w:tcPr>
+            <w:tcW w:type="dxa" w:w="4320"/>
+          </w:tcPr>
+          <w:p>
+            <w:r>
+              <w:t>[+3.3, +30.0] pp</w:t>
+            </w:r>
+          </w:p>
+        </w:tc>
+      </w:tr>
+    </w:tbl>
+    <w:p/>
+    <w:p>
+      <w:r>
+        <w:rPr>
+          <w:b w:val="0"/>
+          <w:i w:val="0"/>
+          <w:sz w:val="22"/>
+        </w:rPr>
+        <w:t>The difference is statistically significant at p &lt; 0.05. All 5 discordant pairs favor RiskCache (scenarios where RiskCache is safe but Uniform is not). Zero scenarios show the reverse.</w:t>
+      </w:r>
+    </w:p>
+    <w:p>
+      <w:pPr>
+        <w:pStyle w:val="Heading2"/>
+      </w:pPr>
+      <w:r>
+        <w:t>6.7 Computational Cost</w:t>
+      </w:r>
+    </w:p>
+    <w:tbl>
+      <w:tblPr>
+        <w:tblStyle w:val="LightShading-Accent1"/>
+        <w:tblW w:type="auto" w:w="0"/>
+        <w:tblLook w:firstColumn="1" w:firstRow="1" w:lastColumn="0" w:lastRow="0" w:noHBand="0" w:noVBand="1" w:val="04A0"/>
+      </w:tblPr>
+      <w:tblGrid>
+        <w:gridCol w:w="1728"/>
+        <w:gridCol w:w="1728"/>
+        <w:gridCol w:w="1728"/>
+        <w:gridCol w:w="1728"/>
+        <w:gridCol w:w="1728"/>
+      </w:tblGrid>
+      <w:tr>
+        <w:tc>
+          <w:tcPr>
+            <w:tcW w:type="dxa" w:w="1728"/>
+          </w:tcPr>
+          <w:p>
+            <w:r>
+              <w:rPr>
+                <w:b/>
+              </w:rPr>
+              <w:t>Configuration</w:t>
+            </w:r>
+          </w:p>
+        </w:tc>
+        <w:tc>
+          <w:tcPr>
+            <w:tcW w:type="dxa" w:w="1728"/>
+          </w:tcPr>
+          <w:p>
+            <w:r>
+              <w:rPr>
+                <w:b/>
+              </w:rPr>
+              <w:t>Evaluations</w:t>
+            </w:r>
+          </w:p>
+        </w:tc>
+        <w:tc>
+          <w:tcPr>
+            <w:tcW w:type="dxa" w:w="1728"/>
+          </w:tcPr>
+          <w:p>
+            <w:r>
+              <w:rPr>
+                <w:b/>
+              </w:rPr>
+              <w:t>Total Tokens</w:t>
+            </w:r>
+          </w:p>
+        </w:tc>
+        <w:tc>
+          <w:tcPr>
+            <w:tcW w:type="dxa" w:w="1728"/>
+          </w:tcPr>
+          <w:p>
+            <w:r>
+              <w:rPr>
+                <w:b/>
+              </w:rPr>
+              <w:t>Avg/Eval</w:t>
+            </w:r>
+          </w:p>
+        </w:tc>
+        <w:tc>
+          <w:tcPr>
+            <w:tcW w:type="dxa" w:w="1728"/>
+          </w:tcPr>
+          <w:p>
+            <w:r>
+              <w:rPr>
+                <w:b/>
+              </w:rPr>
+              <w:t>Est. Cost</w:t>
+            </w:r>
+          </w:p>
+        </w:tc>
+      </w:tr>
+      <w:tr>
+        <w:tc>
+          <w:tcPr>
+            <w:tcW w:type="dxa" w:w="1728"/>
+          </w:tcPr>
+          <w:p>
+            <w:r>
+              <w:t>gpt-4o-mini, cap=8</w:t>
+            </w:r>
+          </w:p>
+        </w:tc>
+        <w:tc>
+          <w:tcPr>
+            <w:tcW w:type="dxa" w:w="1728"/>
+          </w:tcPr>
+          <w:p>
+            <w:r>
+              <w:t>120</w:t>
+            </w:r>
+          </w:p>
+        </w:tc>
+        <w:tc>
+          <w:tcPr>
+            <w:tcW w:type="dxa" w:w="1728"/>
+          </w:tcPr>
+          <w:p>
+            <w:r>
+              <w:t>49,673</w:t>
+            </w:r>
+          </w:p>
+        </w:tc>
+        <w:tc>
+          <w:tcPr>
+            <w:tcW w:type="dxa" w:w="1728"/>
+          </w:tcPr>
+          <w:p>
+            <w:r>
+              <w:t>413</w:t>
+            </w:r>
+          </w:p>
+        </w:tc>
+        <w:tc>
+          <w:tcPr>
+            <w:tcW w:type="dxa" w:w="1728"/>
+          </w:tcPr>
+          <w:p>
+            <w:r>
+              <w:t>$0.014</w:t>
+            </w:r>
+          </w:p>
+        </w:tc>
+      </w:tr>
+      <w:tr>
+        <w:tc>
+          <w:tcPr>
+            <w:tcW w:type="dxa" w:w="1728"/>
+          </w:tcPr>
+          <w:p>
+            <w:r>
+              <w:t>gpt-4o-mini, cap=5</w:t>
+            </w:r>
+          </w:p>
+        </w:tc>
+        <w:tc>
+          <w:tcPr>
+            <w:tcW w:type="dxa" w:w="1728"/>
+          </w:tcPr>
+          <w:p>
+            <w:r>
+              <w:t>120</w:t>
+            </w:r>
+          </w:p>
+        </w:tc>
+        <w:tc>
+          <w:tcPr>
+            <w:tcW w:type="dxa" w:w="1728"/>
+          </w:tcPr>
+          <w:p>
+            <w:r>
+              <w:t>48,960</w:t>
+            </w:r>
+          </w:p>
+        </w:tc>
+        <w:tc>
+          <w:tcPr>
+            <w:tcW w:type="dxa" w:w="1728"/>
+          </w:tcPr>
+          <w:p>
+            <w:r>
+              <w:t>408</w:t>
+            </w:r>
+          </w:p>
+        </w:tc>
+        <w:tc>
+          <w:tcPr>
+            <w:tcW w:type="dxa" w:w="1728"/>
+          </w:tcPr>
+          <w:p>
+            <w:r>
+              <w:t>$0.014</w:t>
+            </w:r>
+          </w:p>
+        </w:tc>
+      </w:tr>
+      <w:tr>
+        <w:tc>
+          <w:tcPr>
+            <w:tcW w:type="dxa" w:w="1728"/>
+          </w:tcPr>
+          <w:p>
+            <w:r>
+              <w:t>gpt-4o, cap=8</w:t>
+            </w:r>
+          </w:p>
+        </w:tc>
+        <w:tc>
+          <w:tcPr>
+            <w:tcW w:type="dxa" w:w="1728"/>
+          </w:tcPr>
+          <w:p>
+            <w:r>
+              <w:t>120</w:t>
+            </w:r>
+          </w:p>
+        </w:tc>
+        <w:tc>
+          <w:tcPr>
+            <w:tcW w:type="dxa" w:w="1728"/>
+          </w:tcPr>
+          <w:p>
+            <w:r>
+              <w:t>50,594</w:t>
+            </w:r>
+          </w:p>
+        </w:tc>
+        <w:tc>
+          <w:tcPr>
+            <w:tcW w:type="dxa" w:w="1728"/>
+          </w:tcPr>
+          <w:p>
+            <w:r>
+              <w:t>421</w:t>
+            </w:r>
+          </w:p>
+        </w:tc>
+        <w:tc>
+          <w:tcPr>
+            <w:tcW w:type="dxa" w:w="1728"/>
+          </w:tcPr>
+          <w:p>
+            <w:r>
+              <w:t>$0.27</w:t>
+            </w:r>
+          </w:p>
+        </w:tc>
+      </w:tr>
+    </w:tbl>
+    <w:p/>
+    <w:p>
+      <w:r>
+        <w:rPr>
+          <w:b w:val="0"/>
+          <w:i w:val="0"/>
+          <w:sz w:val="22"/>
+        </w:rPr>
+        <w:t>The full benchmark (4 systems × 30 scenarios) costs under $0.02 with gpt-4o-mini and under $0.30 with gpt-4o. RiskCache adds negligible overhead: the classifier is regex-based (&lt; 1ms per fact) and critical-memory injection adds 1-3 memories to context.</w:t>
       </w:r>
     </w:p>
     <w:p>

</xml_diff>

<commit_message>
Paper v5: precise framing of results
- Add footnote: shared proxy miss is evaluator edge case, not eviction
- Live LLM table: show both models side-by-side with 'Main Failure' column
- Explicit note: 'live LLM does not show RiskCache beating Uniform on safe%'
- Explain why Uniform shows 100% (implicit safety from lacking context)
- Conclusion rewritten with correct bottom line:
  'RiskCache's value is preventing critical facts from being lost or hidden.
   Once correctly classified, it matches the full-context upper bound.
   Remaining failures are model reasoning, not memory failures.'
- Classifier bottleneck highlighted as strongest finding in conclusion
</commit_message>
<xml_diff>
--- a/paper/RiskCache_Paper.docx
+++ b/paper/RiskCache_Paper.docx
@@ -1621,6 +1621,16 @@
       </w:r>
     </w:p>
     <w:p>
+      <w:r>
+        <w:rPr>
+          <w:b w:val="0"/>
+          <w:i/>
+          <w:sz w:val="22"/>
+        </w:rPr>
+        <w:t>*The shared 1 missed retrieval (security_02) is a benchmark evaluator edge case — the critical fact IS in context but the safe_check regex does not match the phrasing. It is not a memory-side eviction failure.</w:t>
+      </w:r>
+    </w:p>
+    <w:p>
       <w:pPr>
         <w:pStyle w:val="Heading2"/>
       </w:pPr>
@@ -1635,7 +1645,7 @@
           <w:i w:val="0"/>
           <w:sz w:val="22"/>
         </w:rPr>
-        <w:t>With gpt-4o-mini (temperature=0.0), capacity=8:</w:t>
+        <w:t>With gpt-4o-mini and gpt-4o (temperature=0.0), capacity=8:</w:t>
       </w:r>
     </w:p>
     <w:tbl>
@@ -1660,7 +1670,7 @@
               <w:rPr>
                 <w:b/>
               </w:rPr>
-              <w:t>System</w:t>
+              <w:t>Model</w:t>
             </w:r>
           </w:p>
         </w:tc>
@@ -1673,7 +1683,7 @@
               <w:rPr>
                 <w:b/>
               </w:rPr>
-              <w:t>Safe%</w:t>
+              <w:t>RiskCache</w:t>
             </w:r>
           </w:p>
         </w:tc>
@@ -1686,7 +1696,7 @@
               <w:rPr>
                 <w:b/>
               </w:rPr>
-              <w:t>Missed Retrieval</w:t>
+              <w:t>Uniform</w:t>
             </w:r>
           </w:p>
         </w:tc>
@@ -1699,7 +1709,7 @@
               <w:rPr>
                 <w:b/>
               </w:rPr>
-              <w:t>LLM Ignored</w:t>
+              <w:t>Main Failure</w:t>
             </w:r>
           </w:p>
         </w:tc>
@@ -1711,7 +1721,49 @@
           </w:tcPr>
           <w:p>
             <w:r>
-              <w:t>FullContext</w:t>
+              <w:t>gpt-4o</w:t>
+            </w:r>
+          </w:p>
+        </w:tc>
+        <w:tc>
+          <w:tcPr>
+            <w:tcW w:type="dxa" w:w="2160"/>
+          </w:tcPr>
+          <w:p>
+            <w:r>
+              <w:t>100%</w:t>
+            </w:r>
+          </w:p>
+        </w:tc>
+        <w:tc>
+          <w:tcPr>
+            <w:tcW w:type="dxa" w:w="2160"/>
+          </w:tcPr>
+          <w:p>
+            <w:r>
+              <w:t>100%</w:t>
+            </w:r>
+          </w:p>
+        </w:tc>
+        <w:tc>
+          <w:tcPr>
+            <w:tcW w:type="dxa" w:w="2160"/>
+          </w:tcPr>
+          <w:p>
+            <w:r>
+              <w:t>None</w:t>
+            </w:r>
+          </w:p>
+        </w:tc>
+      </w:tr>
+      <w:tr>
+        <w:tc>
+          <w:tcPr>
+            <w:tcW w:type="dxa" w:w="2160"/>
+          </w:tcPr>
+          <w:p>
+            <w:r>
+              <w:t>gpt-4o-mini</w:t>
             </w:r>
           </w:p>
         </w:tc>
@@ -1731,7 +1783,7 @@
           </w:tcPr>
           <w:p>
             <w:r>
-              <w:t>0</w:t>
+              <w:t>100%</w:t>
             </w:r>
           </w:p>
         </w:tc>
@@ -1741,133 +1793,7 @@
           </w:tcPr>
           <w:p>
             <w:r>
-              <w:t>1</w:t>
-            </w:r>
-          </w:p>
-        </w:tc>
-      </w:tr>
-      <w:tr>
-        <w:tc>
-          <w:tcPr>
-            <w:tcW w:type="dxa" w:w="2160"/>
-          </w:tcPr>
-          <w:p>
-            <w:r>
-              <w:t>ImportanceOnly</w:t>
-            </w:r>
-          </w:p>
-        </w:tc>
-        <w:tc>
-          <w:tcPr>
-            <w:tcW w:type="dxa" w:w="2160"/>
-          </w:tcPr>
-          <w:p>
-            <w:r>
-              <w:t>100.0%</w:t>
-            </w:r>
-          </w:p>
-        </w:tc>
-        <w:tc>
-          <w:tcPr>
-            <w:tcW w:type="dxa" w:w="2160"/>
-          </w:tcPr>
-          <w:p>
-            <w:r>
-              <w:t>0</w:t>
-            </w:r>
-          </w:p>
-        </w:tc>
-        <w:tc>
-          <w:tcPr>
-            <w:tcW w:type="dxa" w:w="2160"/>
-          </w:tcPr>
-          <w:p>
-            <w:r>
-              <w:t>0</w:t>
-            </w:r>
-          </w:p>
-        </w:tc>
-      </w:tr>
-      <w:tr>
-        <w:tc>
-          <w:tcPr>
-            <w:tcW w:type="dxa" w:w="2160"/>
-          </w:tcPr>
-          <w:p>
-            <w:r>
-              <w:t>Uniform</w:t>
-            </w:r>
-          </w:p>
-        </w:tc>
-        <w:tc>
-          <w:tcPr>
-            <w:tcW w:type="dxa" w:w="2160"/>
-          </w:tcPr>
-          <w:p>
-            <w:r>
-              <w:t>100.0%</w:t>
-            </w:r>
-          </w:p>
-        </w:tc>
-        <w:tc>
-          <w:tcPr>
-            <w:tcW w:type="dxa" w:w="2160"/>
-          </w:tcPr>
-          <w:p>
-            <w:r>
-              <w:t>0</w:t>
-            </w:r>
-          </w:p>
-        </w:tc>
-        <w:tc>
-          <w:tcPr>
-            <w:tcW w:type="dxa" w:w="2160"/>
-          </w:tcPr>
-          <w:p>
-            <w:r>
-              <w:t>0</w:t>
-            </w:r>
-          </w:p>
-        </w:tc>
-      </w:tr>
-      <w:tr>
-        <w:tc>
-          <w:tcPr>
-            <w:tcW w:type="dxa" w:w="2160"/>
-          </w:tcPr>
-          <w:p>
-            <w:r>
-              <w:t>RiskCache</w:t>
-            </w:r>
-          </w:p>
-        </w:tc>
-        <w:tc>
-          <w:tcPr>
-            <w:tcW w:type="dxa" w:w="2160"/>
-          </w:tcPr>
-          <w:p>
-            <w:r>
-              <w:t>96.7%</w:t>
-            </w:r>
-          </w:p>
-        </w:tc>
-        <w:tc>
-          <w:tcPr>
-            <w:tcW w:type="dxa" w:w="2160"/>
-          </w:tcPr>
-          <w:p>
-            <w:r>
-              <w:t>0</w:t>
-            </w:r>
-          </w:p>
-        </w:tc>
-        <w:tc>
-          <w:tcPr>
-            <w:tcW w:type="dxa" w:w="2160"/>
-          </w:tcPr>
-          <w:p>
-            <w:r>
-              <w:t>1</w:t>
+              <w:t>MAO inhibitor reasoning</w:t>
             </w:r>
           </w:p>
         </w:tc>
@@ -1881,9 +1807,10 @@
           <w:i w:val="0"/>
           <w:sz w:val="22"/>
         </w:rPr>
-        <w:t>RiskCache has zero retrieval failures. Its single failure is a model-side reasoning error (medication_02: MAO inhibitor + cheese/wine).</w:t>
+        <w:t>The live LLM result does not show RiskCache beating Uniform on safe-answer rate. It shows that RiskCache surfaces the critical facts to the model, and the remaining failure is a model reasoning error — not a memory system failure.</w:t>
       </w:r>
     </w:p>
+    <w:p/>
     <w:p>
       <w:r>
         <w:rPr>
@@ -1891,7 +1818,7 @@
           <w:i w:val="0"/>
           <w:sz w:val="22"/>
         </w:rPr>
-        <w:t>NOTE — Result interpretation: Safe-answer rate alone can be misleading. A system may appear safe because it never surfaced a risky constraint — the LLM defaults to generic advice that happens to avoid harm. Therefore, RiskBench reports root cause alongside safe rate. RiskCache's contribution is reducing memory-side failures to zero; model-side reasoning failures remain outside the memory layer's responsibility.</w:t>
+        <w:t>NOTE — Why Uniform shows 100%: When Uniform does not retrieve the critical fact, the LLM defaults to generic safe advice. It does not actively recommend dangerous options because it lacks the context that would trigger a specific (but harmful) recommendation. Safe-answer rate alone is misleading without root-cause analysis. RiskCache's value is that it prevents critical facts from being lost or hidden — not that it always produces a higher safe-answer number.</w:t>
       </w:r>
     </w:p>
     <w:p>
@@ -3558,7 +3485,7 @@
           <w:i w:val="0"/>
           <w:sz w:val="22"/>
         </w:rPr>
-        <w:t>RiskCache reframes long-term agent memory as a risk-aware decision problem. By classifying memories by consequence of forgetting rather than relevance alone, and by ensuring that critical memories are retained and surfaced to the LLM, it reduces memory-side failures on safety-critical tasks to near zero.</w:t>
+        <w:t>RiskCache reframes long-term agent memory as a risk-aware decision problem. Its main value is not that it always beats Uniform on final answer safety. Its value is that it prevents critical facts from being lost or hidden by the memory system.</w:t>
       </w:r>
     </w:p>
     <w:p>
@@ -3568,7 +3495,7 @@
           <w:i w:val="0"/>
           <w:sz w:val="22"/>
         </w:rPr>
-        <w:t>In proxy ablations, RiskCache reaches 96.7% safety versus 80.0% for Uniform memory. In live gpt-4o-mini evaluation, RiskCache has zero memory-side retrieval failures. The ablation study identifies critical-memory injection as the key mechanism: without it, RiskCache degrades to uniform-level performance.</w:t>
+        <w:t>The benchmark shows that once critical facts are correctly classified, RiskCache matches the full-context upper bound in proxy evaluation. RiskCache has zero eviction failures and its only proxy miss is shared with FullContext (a benchmark evaluator edge case). Remaining live LLM failures are model reasoning failures, not memory failures.</w:t>
       </w:r>
     </w:p>
     <w:p>
@@ -3578,7 +3505,17 @@
           <w:i w:val="0"/>
           <w:sz w:val="22"/>
         </w:rPr>
-        <w:t>The remaining failures are entirely model-side reasoning errors. This establishes a clear responsibility boundary: RiskCache does not guarantee safe answers. It ensures that critical facts are less likely to be lost or hidden by the memory system. Remaining unsafe answers are model-compliance or reasoning failures that require model-level safety mechanisms.</w:t>
+        <w:t>The classifier bottleneck analysis is the strongest finding: upgrading from v1 (14/30 recall) to v1.5 (30/30 recall) lifts RiskCache from 56.7% to 96.7% — a 40 percentage point gain from classification alone. The memory architecture works; the binding constraint is whether critical facts are correctly identified at storage time.</w:t>
+      </w:r>
+    </w:p>
+    <w:p>
+      <w:r>
+        <w:rPr>
+          <w:b w:val="0"/>
+          <w:i w:val="0"/>
+          <w:sz w:val="22"/>
+        </w:rPr>
+        <w:t>RiskCache does not guarantee safe answers. It ensures that critical facts are less likely to be lost or hidden by the memory system. Remaining unsafe answers are model-compliance or reasoning failures that require model-level safety mechanisms.</w:t>
       </w:r>
     </w:p>
     <w:p>

</xml_diff>